<commit_message>
Updated Threat Prioritization Plan secondary document (higher res diagrams, minor text revisions)
</commit_message>
<xml_diff>
--- a/source/reference_documents/secondary_documents/foundation phase/Threat Prioritization Plan/Threat Prioritization Plan.docx
+++ b/source/reference_documents/secondary_documents/foundation phase/Threat Prioritization Plan/Threat Prioritization Plan.docx
@@ -1,6 +1,6 @@
 
 <file path=word/document.xml><?xml version="1.0" encoding="utf-8"?>
-<w:document xmlns:wpc="http://schemas.microsoft.com/office/word/2010/wordprocessingCanvas" xmlns:cx="http://schemas.microsoft.com/office/drawing/2014/chartex" xmlns:cx1="http://schemas.microsoft.com/office/drawing/2015/9/8/chartex" xmlns:cx2="http://schemas.microsoft.com/office/drawing/2015/10/21/chartex" xmlns:cx3="http://schemas.microsoft.com/office/drawing/2016/5/9/chartex" xmlns:cx4="http://schemas.microsoft.com/office/drawing/2016/5/10/chartex" xmlns:cx5="http://schemas.microsoft.com/office/drawing/2016/5/11/chartex" xmlns:cx6="http://schemas.microsoft.com/office/drawing/2016/5/12/chartex" xmlns:cx7="http://schemas.microsoft.com/office/drawing/2016/5/13/chartex" xmlns:cx8="http://schemas.microsoft.com/office/drawing/2016/5/14/chartex" xmlns:mc="http://schemas.openxmlformats.org/markup-compatibility/2006" xmlns:aink="http://schemas.microsoft.com/office/drawing/2016/ink" xmlns:am3d="http://schemas.microsoft.com/office/drawing/2017/model3d" xmlns:o="urn:schemas-microsoft-com:office:office" xmlns:oel="http://schemas.microsoft.com/office/2019/extlst" xmlns:r="http://schemas.openxmlformats.org/officeDocument/2006/relationships" xmlns:m="http://schemas.openxmlformats.org/officeDocument/2006/math" xmlns:v="urn:schemas-microsoft-com:vml" xmlns:wp14="http://schemas.microsoft.com/office/word/2010/wordprocessingDrawing" xmlns:wp="http://schemas.openxmlformats.org/drawingml/2006/wordprocessingDrawing" xmlns:w10="urn:schemas-microsoft-com:office:word" xmlns:w="http://schemas.openxmlformats.org/wordprocessingml/2006/main" xmlns:w14="http://schemas.microsoft.com/office/word/2010/wordml" xmlns:w15="http://schemas.microsoft.com/office/word/2012/wordml" xmlns:w16cex="http://schemas.microsoft.com/office/word/2018/wordml/cex" xmlns:w16cid="http://schemas.microsoft.com/office/word/2016/wordml/cid" xmlns:w16="http://schemas.microsoft.com/office/word/2018/wordml" xmlns:w16sdtdh="http://schemas.microsoft.com/office/word/2020/wordml/sdtdatahash" xmlns:w16se="http://schemas.microsoft.com/office/word/2015/wordml/symex" xmlns:wpg="http://schemas.microsoft.com/office/word/2010/wordprocessingGroup" xmlns:wpi="http://schemas.microsoft.com/office/word/2010/wordprocessingInk" xmlns:wne="http://schemas.microsoft.com/office/word/2006/wordml" xmlns:wps="http://schemas.microsoft.com/office/word/2010/wordprocessingShape" mc:Ignorable="w14 w15 w16se w16cid w16 w16cex w16sdtdh wp14">
+<w:document xmlns:wpc="http://schemas.microsoft.com/office/word/2010/wordprocessingCanvas" xmlns:cx="http://schemas.microsoft.com/office/drawing/2014/chartex" xmlns:cx1="http://schemas.microsoft.com/office/drawing/2015/9/8/chartex" xmlns:cx2="http://schemas.microsoft.com/office/drawing/2015/10/21/chartex" xmlns:cx3="http://schemas.microsoft.com/office/drawing/2016/5/9/chartex" xmlns:cx4="http://schemas.microsoft.com/office/drawing/2016/5/10/chartex" xmlns:cx5="http://schemas.microsoft.com/office/drawing/2016/5/11/chartex" xmlns:cx6="http://schemas.microsoft.com/office/drawing/2016/5/12/chartex" xmlns:cx7="http://schemas.microsoft.com/office/drawing/2016/5/13/chartex" xmlns:cx8="http://schemas.microsoft.com/office/drawing/2016/5/14/chartex" xmlns:mc="http://schemas.openxmlformats.org/markup-compatibility/2006" xmlns:aink="http://schemas.microsoft.com/office/drawing/2016/ink" xmlns:am3d="http://schemas.microsoft.com/office/drawing/2017/model3d" xmlns:o="urn:schemas-microsoft-com:office:office" xmlns:oel="http://schemas.microsoft.com/office/2019/extlst" xmlns:r="http://schemas.openxmlformats.org/officeDocument/2006/relationships" xmlns:m="http://schemas.openxmlformats.org/officeDocument/2006/math" xmlns:v="urn:schemas-microsoft-com:vml" xmlns:wp14="http://schemas.microsoft.com/office/word/2010/wordprocessingDrawing" xmlns:wp="http://schemas.openxmlformats.org/drawingml/2006/wordprocessingDrawing" xmlns:w10="urn:schemas-microsoft-com:office:word" xmlns:w="http://schemas.openxmlformats.org/wordprocessingml/2006/main" xmlns:w14="http://schemas.microsoft.com/office/word/2010/wordml" xmlns:w15="http://schemas.microsoft.com/office/word/2012/wordml" xmlns:w16cex="http://schemas.microsoft.com/office/word/2018/wordml/cex" xmlns:w16cid="http://schemas.microsoft.com/office/word/2016/wordml/cid" xmlns:w16="http://schemas.microsoft.com/office/word/2018/wordml" xmlns:w16du="http://schemas.microsoft.com/office/word/2023/wordml/word16du" xmlns:w16sdtdh="http://schemas.microsoft.com/office/word/2020/wordml/sdtdatahash" xmlns:w16sdtfl="http://schemas.microsoft.com/office/word/2024/wordml/sdtformatlock" xmlns:w16se="http://schemas.microsoft.com/office/word/2015/wordml/symex" xmlns:wpg="http://schemas.microsoft.com/office/word/2010/wordprocessingGroup" xmlns:wpi="http://schemas.microsoft.com/office/word/2010/wordprocessingInk" xmlns:wne="http://schemas.microsoft.com/office/word/2006/wordml" xmlns:wps="http://schemas.microsoft.com/office/word/2010/wordprocessingShape" mc:Ignorable="w14 w15 w16se w16cid w16 w16cex w16sdtdh w16sdtfl w16du wp14">
   <w:body>
     <w:p>
       <w:pPr>
@@ -31,7 +31,7 @@
         <w:t>1</w:t>
       </w:r>
       <w:r>
-        <w:t>4</w:t>
+        <w:t>5</w:t>
       </w:r>
     </w:p>
     <w:p>
@@ -51,7 +51,7 @@
         <w:rPr>
           <w:noProof/>
         </w:rPr>
-        <w:t>10/2/23 10:47 AM</w:t>
+        <w:t>7/9/26 11:17 AM</w:t>
       </w:r>
       <w:r>
         <w:fldChar w:fldCharType="end"/>
@@ -94,7 +94,25 @@
         <w:t>process</w:t>
       </w:r>
       <w:r>
-        <w:t xml:space="preserve"> to be used to formally develop threat models and process the results from that activity into actionable issues able to be dispositioned by development teams.</w:t>
+        <w:t xml:space="preserve"> to be used to </w:t>
+      </w:r>
+      <w:r>
+        <w:t>translate</w:t>
+      </w:r>
+      <w:r>
+        <w:t xml:space="preserve"> the </w:t>
+      </w:r>
+      <w:r>
+        <w:t>threat candidates identified by various</w:t>
+      </w:r>
+      <w:r>
+        <w:t xml:space="preserve"> </w:t>
+      </w:r>
+      <w:r>
+        <w:t>cybersecurity activities</w:t>
+      </w:r>
+      <w:r>
+        <w:t xml:space="preserve"> into actionable issues able to be dispositioned by development teams.</w:t>
       </w:r>
     </w:p>
     <w:p>
@@ -127,31 +145,58 @@
     </w:p>
     <w:p>
       <w:pPr>
+        <w:spacing w:after="240"/>
         <w:jc w:val="both"/>
       </w:pPr>
       <w:r>
-        <w:t xml:space="preserve">This document is motivated by the need to have formal processes in place regarding discovery and disposition of security-related threats to allow for certification of compliance to standards such as </w:t>
-      </w:r>
-      <w:r>
-        <w:rPr>
-          <w:b/>
-          <w:bCs/>
-        </w:rPr>
-        <w:t>ISO</w:t>
-      </w:r>
-      <w:r>
-        <w:rPr>
-          <w:b/>
-          <w:bCs/>
-        </w:rPr>
-        <w:t>/SAE</w:t>
-      </w:r>
-      <w:r>
-        <w:rPr>
-          <w:b/>
-          <w:bCs/>
-        </w:rPr>
-        <w:t xml:space="preserve"> 21434</w:t>
+        <w:t xml:space="preserve">This document is motivated by the need to have formal processes in place regarding </w:t>
+      </w:r>
+      <w:r>
+        <w:t xml:space="preserve">the </w:t>
+      </w:r>
+      <w:r>
+        <w:t xml:space="preserve">disposition of </w:t>
+      </w:r>
+      <w:r>
+        <w:t>cyber</w:t>
+      </w:r>
+      <w:r>
+        <w:t xml:space="preserve">security-related threats </w:t>
+      </w:r>
+      <w:r>
+        <w:t>in the context of the development of safety-critical, cyber-physical systems</w:t>
+      </w:r>
+      <w:r>
+        <w:t>.</w:t>
+      </w:r>
+    </w:p>
+    <w:p>
+      <w:pPr>
+        <w:pStyle w:val="Note"/>
+        <w:spacing w:after="0"/>
+      </w:pPr>
+      <w:bookmarkStart w:id="4" w:name="_e2tp8v13fd6n" w:colFirst="0" w:colLast="0"/>
+      <w:bookmarkEnd w:id="4"/>
+      <w:r>
+        <w:rPr>
+          <w:b/>
+          <w:bCs/>
+          <w:color w:val="0070C0"/>
+        </w:rPr>
+        <w:t>Note:</w:t>
+      </w:r>
+      <w:r>
+        <w:tab/>
+        <w:t xml:space="preserve">Within the context of this document, the terms </w:t>
+      </w:r>
+      <w:r>
+        <w:rPr>
+          <w:b/>
+          <w:bCs/>
+          <w:i/>
+          <w:iCs/>
+        </w:rPr>
+        <w:t>security</w:t>
       </w:r>
       <w:r>
         <w:t xml:space="preserve"> and </w:t>
@@ -160,8 +205,46 @@
         <w:rPr>
           <w:b/>
           <w:bCs/>
-        </w:rPr>
-        <w:t>ISO 26262</w:t>
+          <w:i/>
+          <w:iCs/>
+        </w:rPr>
+        <w:t>cybersecurity</w:t>
+      </w:r>
+      <w:r>
+        <w:t xml:space="preserve"> are used interchangeably. It is presumed that the term </w:t>
+      </w:r>
+      <w:r>
+        <w:rPr>
+          <w:b/>
+          <w:bCs/>
+          <w:i/>
+          <w:iCs/>
+        </w:rPr>
+        <w:t>security</w:t>
+      </w:r>
+      <w:r>
+        <w:t xml:space="preserve"> is being used in reference to </w:t>
+      </w:r>
+      <w:r>
+        <w:rPr>
+          <w:b/>
+          <w:bCs/>
+          <w:i/>
+          <w:iCs/>
+        </w:rPr>
+        <w:t>cybersecurity</w:t>
+      </w:r>
+      <w:r>
+        <w:t xml:space="preserve"> and not </w:t>
+      </w:r>
+      <w:r>
+        <w:rPr>
+          <w:b/>
+          <w:bCs/>
+          <w:i/>
+          <w:iCs/>
+        </w:rPr>
+        <w:t>physical security</w:t>
       </w:r>
       <w:r>
         <w:t>.</w:t>
@@ -172,8 +255,6 @@
         <w:pStyle w:val="Heading1"/>
         <w:jc w:val="both"/>
       </w:pPr>
-      <w:bookmarkStart w:id="4" w:name="_e2tp8v13fd6n" w:colFirst="0" w:colLast="0"/>
-      <w:bookmarkEnd w:id="4"/>
       <w:r>
         <w:t>License</w:t>
       </w:r>
@@ -192,7 +273,19 @@
         <w:rPr>
           <w:lang w:val="en-US"/>
         </w:rPr>
-        <w:t xml:space="preserve">was created by </w:t>
+        <w:t xml:space="preserve">was </w:t>
+      </w:r>
+      <w:r>
+        <w:rPr>
+          <w:lang w:val="en-US"/>
+        </w:rPr>
+        <w:t xml:space="preserve">originally </w:t>
+      </w:r>
+      <w:r>
+        <w:rPr>
+          <w:lang w:val="en-US"/>
+        </w:rPr>
+        <w:t xml:space="preserve">created by </w:t>
       </w:r>
       <w:r>
         <w:rPr>
@@ -321,9 +414,9 @@
           <w:noProof/>
         </w:rPr>
         <w:drawing>
-          <wp:inline distT="0" distB="0" distL="0" distR="0" wp14:anchorId="5177C06D" wp14:editId="6046E100">
-            <wp:extent cx="5943600" cy="2447364"/>
-            <wp:effectExtent l="0" t="0" r="0" b="3810"/>
+          <wp:inline distT="0" distB="0" distL="0" distR="0" wp14:anchorId="5177C06D" wp14:editId="60E15B57">
+            <wp:extent cx="5943600" cy="2444097"/>
+            <wp:effectExtent l="0" t="0" r="0" b="0"/>
             <wp:docPr id="3" name="Picture 3"/>
             <wp:cNvGraphicFramePr>
               <a:graphicFrameLocks xmlns:a="http://schemas.openxmlformats.org/drawingml/2006/main" noChangeAspect="1"/>
@@ -336,7 +429,7 @@
                     <pic:cNvPicPr/>
                   </pic:nvPicPr>
                   <pic:blipFill>
-                    <a:blip r:embed="rId9">
+                    <a:blip r:embed="rId9" cstate="print">
                       <a:extLst>
                         <a:ext uri="{28A0092B-C50C-407E-A947-70E740481C1C}">
                           <a14:useLocalDpi xmlns:a14="http://schemas.microsoft.com/office/drawing/2010/main" val="0"/>
@@ -350,7 +443,7 @@
                   <pic:spPr>
                     <a:xfrm>
                       <a:off x="0" y="0"/>
-                      <a:ext cx="5943600" cy="2447364"/>
+                      <a:ext cx="5943600" cy="2444097"/>
                     </a:xfrm>
                     <a:prstGeom prst="rect">
                       <a:avLst/>
@@ -468,7 +561,6 @@
         <w:tc>
           <w:tcPr>
             <w:tcW w:w="1520" w:type="dxa"/>
-            <w:shd w:val="clear" w:color="auto" w:fill="auto"/>
             <w:tcMar>
               <w:top w:w="100" w:type="dxa"/>
               <w:left w:w="100" w:type="dxa"/>
@@ -499,7 +591,6 @@
         <w:tc>
           <w:tcPr>
             <w:tcW w:w="2880" w:type="dxa"/>
-            <w:shd w:val="clear" w:color="auto" w:fill="auto"/>
             <w:tcMar>
               <w:top w:w="100" w:type="dxa"/>
               <w:left w:w="100" w:type="dxa"/>
@@ -522,7 +613,6 @@
         <w:tc>
           <w:tcPr>
             <w:tcW w:w="1520" w:type="dxa"/>
-            <w:shd w:val="clear" w:color="auto" w:fill="auto"/>
             <w:tcMar>
               <w:top w:w="100" w:type="dxa"/>
               <w:left w:w="100" w:type="dxa"/>
@@ -553,7 +643,6 @@
         <w:tc>
           <w:tcPr>
             <w:tcW w:w="2880" w:type="dxa"/>
-            <w:shd w:val="clear" w:color="auto" w:fill="auto"/>
             <w:tcMar>
               <w:top w:w="100" w:type="dxa"/>
               <w:left w:w="100" w:type="dxa"/>
@@ -576,7 +665,6 @@
         <w:tc>
           <w:tcPr>
             <w:tcW w:w="1520" w:type="dxa"/>
-            <w:shd w:val="clear" w:color="auto" w:fill="auto"/>
             <w:tcMar>
               <w:top w:w="100" w:type="dxa"/>
               <w:left w:w="100" w:type="dxa"/>
@@ -607,7 +695,6 @@
         <w:tc>
           <w:tcPr>
             <w:tcW w:w="2880" w:type="dxa"/>
-            <w:shd w:val="clear" w:color="auto" w:fill="auto"/>
             <w:tcMar>
               <w:top w:w="100" w:type="dxa"/>
               <w:left w:w="100" w:type="dxa"/>
@@ -637,9 +724,9 @@
           <w:noProof/>
         </w:rPr>
         <w:drawing>
-          <wp:inline distT="0" distB="0" distL="0" distR="0" wp14:anchorId="51497361" wp14:editId="4EBB8370">
-            <wp:extent cx="4140090" cy="4442286"/>
-            <wp:effectExtent l="0" t="0" r="635" b="3175"/>
+          <wp:inline distT="0" distB="0" distL="0" distR="0" wp14:anchorId="51497361" wp14:editId="0A1EF673">
+            <wp:extent cx="4139402" cy="4442286"/>
+            <wp:effectExtent l="0" t="0" r="1270" b="3175"/>
             <wp:docPr id="4" name="Picture 4"/>
             <wp:cNvGraphicFramePr>
               <a:graphicFrameLocks xmlns:a="http://schemas.openxmlformats.org/drawingml/2006/main" noChangeAspect="1"/>
@@ -652,7 +739,7 @@
                     <pic:cNvPicPr/>
                   </pic:nvPicPr>
                   <pic:blipFill>
-                    <a:blip r:embed="rId10">
+                    <a:blip r:embed="rId10" cstate="print">
                       <a:extLst>
                         <a:ext uri="{28A0092B-C50C-407E-A947-70E740481C1C}">
                           <a14:useLocalDpi xmlns:a14="http://schemas.microsoft.com/office/drawing/2010/main" val="0"/>
@@ -666,7 +753,7 @@
                   <pic:spPr>
                     <a:xfrm>
                       <a:off x="0" y="0"/>
-                      <a:ext cx="4140090" cy="4442286"/>
+                      <a:ext cx="4139402" cy="4442286"/>
                     </a:xfrm>
                     <a:prstGeom prst="rect">
                       <a:avLst/>
@@ -869,7 +956,13 @@
         <w:jc w:val="both"/>
       </w:pPr>
       <w:r>
-        <w:t xml:space="preserve">Threat modeling </w:t>
+        <w:t xml:space="preserve">Threat </w:t>
+      </w:r>
+      <w:r>
+        <w:t>M</w:t>
+      </w:r>
+      <w:r>
+        <w:t xml:space="preserve">odeling </w:t>
       </w:r>
       <w:r>
         <w:rPr>
@@ -892,7 +985,13 @@
         <w:jc w:val="both"/>
       </w:pPr>
       <w:r>
-        <w:t xml:space="preserve">Incident response </w:t>
+        <w:t xml:space="preserve">Incident </w:t>
+      </w:r>
+      <w:r>
+        <w:t>R</w:t>
+      </w:r>
+      <w:r>
+        <w:t xml:space="preserve">esponse </w:t>
       </w:r>
       <w:r>
         <w:rPr>
@@ -915,7 +1014,19 @@
         <w:jc w:val="both"/>
       </w:pPr>
       <w:r>
-        <w:t xml:space="preserve">Attack surface analysis </w:t>
+        <w:t xml:space="preserve">Attack </w:t>
+      </w:r>
+      <w:r>
+        <w:t>S</w:t>
+      </w:r>
+      <w:r>
+        <w:t xml:space="preserve">urface </w:t>
+      </w:r>
+      <w:r>
+        <w:t>A</w:t>
+      </w:r>
+      <w:r>
+        <w:t xml:space="preserve">nalysis </w:t>
       </w:r>
       <w:r>
         <w:rPr>
@@ -926,6 +1037,232 @@
         </w:rPr>
         <w:t>[4]</w:t>
       </w:r>
+    </w:p>
+    <w:p>
+      <w:pPr>
+        <w:pStyle w:val="ListParagraph"/>
+        <w:numPr>
+          <w:ilvl w:val="0"/>
+          <w:numId w:val="5"/>
+        </w:numPr>
+        <w:ind w:left="990" w:hanging="270"/>
+        <w:jc w:val="both"/>
+      </w:pPr>
+      <w:r>
+        <w:t>Deprecated Functions</w:t>
+      </w:r>
+      <w:r>
+        <w:t xml:space="preserve"> </w:t>
+      </w:r>
+      <w:r>
+        <w:rPr>
+          <w:b/>
+          <w:bCs/>
+          <w:color w:val="0070C0"/>
+          <w:vertAlign w:val="superscript"/>
+        </w:rPr>
+        <w:t>[</w:t>
+      </w:r>
+      <w:r>
+        <w:rPr>
+          <w:b/>
+          <w:bCs/>
+          <w:color w:val="0070C0"/>
+          <w:vertAlign w:val="superscript"/>
+        </w:rPr>
+        <w:t>12</w:t>
+      </w:r>
+      <w:r>
+        <w:rPr>
+          <w:b/>
+          <w:bCs/>
+          <w:color w:val="0070C0"/>
+          <w:vertAlign w:val="superscript"/>
+        </w:rPr>
+        <w:t>]</w:t>
+      </w:r>
+    </w:p>
+    <w:p>
+      <w:pPr>
+        <w:pStyle w:val="ListParagraph"/>
+        <w:numPr>
+          <w:ilvl w:val="0"/>
+          <w:numId w:val="5"/>
+        </w:numPr>
+        <w:ind w:left="990" w:hanging="270"/>
+        <w:jc w:val="both"/>
+      </w:pPr>
+      <w:r>
+        <w:t>Static Analysis</w:t>
+      </w:r>
+      <w:r>
+        <w:t xml:space="preserve"> </w:t>
+      </w:r>
+      <w:r>
+        <w:rPr>
+          <w:b/>
+          <w:bCs/>
+          <w:color w:val="0070C0"/>
+          <w:vertAlign w:val="superscript"/>
+        </w:rPr>
+        <w:t>[</w:t>
+      </w:r>
+      <w:r>
+        <w:rPr>
+          <w:b/>
+          <w:bCs/>
+          <w:color w:val="0070C0"/>
+          <w:vertAlign w:val="superscript"/>
+        </w:rPr>
+        <w:t>13</w:t>
+      </w:r>
+      <w:r>
+        <w:rPr>
+          <w:b/>
+          <w:bCs/>
+          <w:color w:val="0070C0"/>
+          <w:vertAlign w:val="superscript"/>
+        </w:rPr>
+        <w:t>]</w:t>
+      </w:r>
+    </w:p>
+    <w:p>
+      <w:pPr>
+        <w:pStyle w:val="ListParagraph"/>
+        <w:numPr>
+          <w:ilvl w:val="0"/>
+          <w:numId w:val="5"/>
+        </w:numPr>
+        <w:ind w:left="990" w:hanging="270"/>
+        <w:jc w:val="both"/>
+      </w:pPr>
+      <w:r>
+        <w:t>Dynamic Analysis</w:t>
+      </w:r>
+      <w:r>
+        <w:t xml:space="preserve"> </w:t>
+      </w:r>
+      <w:r>
+        <w:rPr>
+          <w:b/>
+          <w:bCs/>
+          <w:color w:val="0070C0"/>
+          <w:vertAlign w:val="superscript"/>
+        </w:rPr>
+        <w:t>[</w:t>
+      </w:r>
+      <w:r>
+        <w:rPr>
+          <w:b/>
+          <w:bCs/>
+          <w:color w:val="0070C0"/>
+          <w:vertAlign w:val="superscript"/>
+        </w:rPr>
+        <w:t>1</w:t>
+      </w:r>
+      <w:r>
+        <w:rPr>
+          <w:b/>
+          <w:bCs/>
+          <w:color w:val="0070C0"/>
+          <w:vertAlign w:val="superscript"/>
+        </w:rPr>
+        <w:t>4]</w:t>
+      </w:r>
+    </w:p>
+    <w:p>
+      <w:pPr>
+        <w:pStyle w:val="ListParagraph"/>
+        <w:numPr>
+          <w:ilvl w:val="0"/>
+          <w:numId w:val="5"/>
+        </w:numPr>
+        <w:ind w:left="990" w:hanging="270"/>
+        <w:jc w:val="both"/>
+      </w:pPr>
+      <w:r>
+        <w:t>Fuzz Testing</w:t>
+      </w:r>
+      <w:r>
+        <w:t xml:space="preserve"> </w:t>
+      </w:r>
+      <w:r>
+        <w:rPr>
+          <w:b/>
+          <w:bCs/>
+          <w:color w:val="0070C0"/>
+          <w:vertAlign w:val="superscript"/>
+        </w:rPr>
+        <w:t>[</w:t>
+      </w:r>
+      <w:r>
+        <w:rPr>
+          <w:b/>
+          <w:bCs/>
+          <w:color w:val="0070C0"/>
+          <w:vertAlign w:val="superscript"/>
+        </w:rPr>
+        <w:t>15</w:t>
+      </w:r>
+      <w:r>
+        <w:rPr>
+          <w:b/>
+          <w:bCs/>
+          <w:color w:val="0070C0"/>
+          <w:vertAlign w:val="superscript"/>
+        </w:rPr>
+        <w:t>]</w:t>
+      </w:r>
+    </w:p>
+    <w:p>
+      <w:pPr>
+        <w:pStyle w:val="ListParagraph"/>
+        <w:numPr>
+          <w:ilvl w:val="0"/>
+          <w:numId w:val="5"/>
+        </w:numPr>
+        <w:ind w:left="990" w:hanging="270"/>
+        <w:jc w:val="both"/>
+      </w:pPr>
+      <w:r>
+        <w:t>Penetration Testing</w:t>
+      </w:r>
+      <w:r>
+        <w:t xml:space="preserve"> </w:t>
+      </w:r>
+      <w:r>
+        <w:rPr>
+          <w:b/>
+          <w:bCs/>
+          <w:color w:val="0070C0"/>
+          <w:vertAlign w:val="superscript"/>
+        </w:rPr>
+        <w:t>[</w:t>
+      </w:r>
+      <w:r>
+        <w:rPr>
+          <w:b/>
+          <w:bCs/>
+          <w:color w:val="0070C0"/>
+          <w:vertAlign w:val="superscript"/>
+        </w:rPr>
+        <w:t>16</w:t>
+      </w:r>
+      <w:r>
+        <w:rPr>
+          <w:b/>
+          <w:bCs/>
+          <w:color w:val="0070C0"/>
+          <w:vertAlign w:val="superscript"/>
+        </w:rPr>
+        <w:t>]</w:t>
+      </w:r>
+    </w:p>
+    <w:p>
+      <w:pPr>
+        <w:ind w:left="720"/>
+        <w:jc w:val="both"/>
+      </w:pPr>
     </w:p>
     <w:p>
       <w:pPr>
@@ -981,7 +1318,6 @@
         <w:tc>
           <w:tcPr>
             <w:tcW w:w="1520" w:type="dxa"/>
-            <w:shd w:val="clear" w:color="auto" w:fill="auto"/>
             <w:tcMar>
               <w:top w:w="100" w:type="dxa"/>
               <w:left w:w="100" w:type="dxa"/>
@@ -1012,7 +1348,6 @@
         <w:tc>
           <w:tcPr>
             <w:tcW w:w="3150" w:type="dxa"/>
-            <w:shd w:val="clear" w:color="auto" w:fill="auto"/>
             <w:tcMar>
               <w:top w:w="100" w:type="dxa"/>
               <w:left w:w="100" w:type="dxa"/>
@@ -1035,7 +1370,6 @@
         <w:tc>
           <w:tcPr>
             <w:tcW w:w="1520" w:type="dxa"/>
-            <w:shd w:val="clear" w:color="auto" w:fill="auto"/>
             <w:tcMar>
               <w:top w:w="100" w:type="dxa"/>
               <w:left w:w="100" w:type="dxa"/>
@@ -1066,7 +1400,6 @@
         <w:tc>
           <w:tcPr>
             <w:tcW w:w="3150" w:type="dxa"/>
-            <w:shd w:val="clear" w:color="auto" w:fill="auto"/>
             <w:tcMar>
               <w:top w:w="100" w:type="dxa"/>
               <w:left w:w="100" w:type="dxa"/>
@@ -1098,7 +1431,6 @@
         <w:tc>
           <w:tcPr>
             <w:tcW w:w="1520" w:type="dxa"/>
-            <w:shd w:val="clear" w:color="auto" w:fill="auto"/>
             <w:tcMar>
               <w:top w:w="100" w:type="dxa"/>
               <w:left w:w="100" w:type="dxa"/>
@@ -1129,7 +1461,6 @@
         <w:tc>
           <w:tcPr>
             <w:tcW w:w="3150" w:type="dxa"/>
-            <w:shd w:val="clear" w:color="auto" w:fill="auto"/>
             <w:tcMar>
               <w:top w:w="100" w:type="dxa"/>
               <w:left w:w="100" w:type="dxa"/>
@@ -1159,9 +1490,9 @@
           <w:noProof/>
         </w:rPr>
         <w:drawing>
-          <wp:inline distT="0" distB="0" distL="0" distR="0" wp14:anchorId="31CDC6E2" wp14:editId="28677D95">
-            <wp:extent cx="3902301" cy="4401316"/>
-            <wp:effectExtent l="0" t="0" r="0" b="5715"/>
+          <wp:inline distT="0" distB="0" distL="0" distR="0" wp14:anchorId="31CDC6E2" wp14:editId="7CC0C3A8">
+            <wp:extent cx="3902301" cy="4391336"/>
+            <wp:effectExtent l="0" t="0" r="0" b="3175"/>
             <wp:docPr id="6" name="Picture 6"/>
             <wp:cNvGraphicFramePr>
               <a:graphicFrameLocks xmlns:a="http://schemas.openxmlformats.org/drawingml/2006/main" noChangeAspect="1"/>
@@ -1174,7 +1505,7 @@
                     <pic:cNvPicPr/>
                   </pic:nvPicPr>
                   <pic:blipFill>
-                    <a:blip r:embed="rId11">
+                    <a:blip r:embed="rId11" cstate="print">
                       <a:extLst>
                         <a:ext uri="{28A0092B-C50C-407E-A947-70E740481C1C}">
                           <a14:useLocalDpi xmlns:a14="http://schemas.microsoft.com/office/drawing/2010/main" val="0"/>
@@ -1188,7 +1519,7 @@
                   <pic:spPr>
                     <a:xfrm>
                       <a:off x="0" y="0"/>
-                      <a:ext cx="3902301" cy="4401316"/>
+                      <a:ext cx="3902301" cy="4391336"/>
                     </a:xfrm>
                     <a:prstGeom prst="rect">
                       <a:avLst/>
@@ -1275,7 +1606,6 @@
         <w:tc>
           <w:tcPr>
             <w:tcW w:w="1520" w:type="dxa"/>
-            <w:shd w:val="clear" w:color="auto" w:fill="auto"/>
             <w:tcMar>
               <w:top w:w="100" w:type="dxa"/>
               <w:left w:w="100" w:type="dxa"/>
@@ -1306,7 +1636,6 @@
         <w:tc>
           <w:tcPr>
             <w:tcW w:w="2790" w:type="dxa"/>
-            <w:shd w:val="clear" w:color="auto" w:fill="auto"/>
             <w:tcMar>
               <w:top w:w="100" w:type="dxa"/>
               <w:left w:w="100" w:type="dxa"/>
@@ -1329,7 +1658,6 @@
         <w:tc>
           <w:tcPr>
             <w:tcW w:w="1520" w:type="dxa"/>
-            <w:shd w:val="clear" w:color="auto" w:fill="auto"/>
             <w:tcMar>
               <w:top w:w="100" w:type="dxa"/>
               <w:left w:w="100" w:type="dxa"/>
@@ -1360,7 +1688,6 @@
         <w:tc>
           <w:tcPr>
             <w:tcW w:w="2790" w:type="dxa"/>
-            <w:shd w:val="clear" w:color="auto" w:fill="auto"/>
             <w:tcMar>
               <w:top w:w="100" w:type="dxa"/>
               <w:left w:w="100" w:type="dxa"/>
@@ -1398,7 +1725,6 @@
         <w:tc>
           <w:tcPr>
             <w:tcW w:w="1520" w:type="dxa"/>
-            <w:shd w:val="clear" w:color="auto" w:fill="auto"/>
             <w:tcMar>
               <w:top w:w="100" w:type="dxa"/>
               <w:left w:w="100" w:type="dxa"/>
@@ -1429,7 +1755,6 @@
         <w:tc>
           <w:tcPr>
             <w:tcW w:w="2790" w:type="dxa"/>
-            <w:shd w:val="clear" w:color="auto" w:fill="auto"/>
             <w:tcMar>
               <w:top w:w="100" w:type="dxa"/>
               <w:left w:w="100" w:type="dxa"/>
@@ -1459,8 +1784,8 @@
           <w:noProof/>
         </w:rPr>
         <w:drawing>
-          <wp:inline distT="0" distB="0" distL="0" distR="0" wp14:anchorId="1016644D" wp14:editId="3FB951CD">
-            <wp:extent cx="4931410" cy="4521313"/>
+          <wp:inline distT="0" distB="0" distL="0" distR="0" wp14:anchorId="1016644D" wp14:editId="1C5179F7">
+            <wp:extent cx="4933049" cy="4522817"/>
             <wp:effectExtent l="0" t="0" r="0" b="0"/>
             <wp:docPr id="5" name="Picture 5"/>
             <wp:cNvGraphicFramePr>
@@ -1474,7 +1799,7 @@
                     <pic:cNvPicPr/>
                   </pic:nvPicPr>
                   <pic:blipFill>
-                    <a:blip r:embed="rId12">
+                    <a:blip r:embed="rId12" cstate="print">
                       <a:extLst>
                         <a:ext uri="{28A0092B-C50C-407E-A947-70E740481C1C}">
                           <a14:useLocalDpi xmlns:a14="http://schemas.microsoft.com/office/drawing/2010/main" val="0"/>
@@ -1488,7 +1813,7 @@
                   <pic:spPr>
                     <a:xfrm>
                       <a:off x="0" y="0"/>
-                      <a:ext cx="4933050" cy="4522817"/>
+                      <a:ext cx="4933049" cy="4522817"/>
                     </a:xfrm>
                     <a:prstGeom prst="rect">
                       <a:avLst/>
@@ -1620,8 +1945,8 @@
           <w:noProof/>
         </w:rPr>
         <w:drawing>
-          <wp:inline distT="114300" distB="114300" distL="114300" distR="114300" wp14:anchorId="54C1241E" wp14:editId="5AAAB85A">
-            <wp:extent cx="5918763" cy="3681181"/>
+          <wp:inline distT="114300" distB="114300" distL="114300" distR="114300" wp14:anchorId="54C1241E" wp14:editId="3E341EA2">
+            <wp:extent cx="5918761" cy="3681181"/>
             <wp:effectExtent l="0" t="0" r="0" b="1905"/>
             <wp:docPr id="1" name="image2.png"/>
             <wp:cNvGraphicFramePr/>
@@ -1647,7 +1972,7 @@
                   <pic:spPr>
                     <a:xfrm>
                       <a:off x="0" y="0"/>
-                      <a:ext cx="5918763" cy="3681181"/>
+                      <a:ext cx="5918761" cy="3681181"/>
                     </a:xfrm>
                     <a:prstGeom prst="rect">
                       <a:avLst/>
@@ -2008,9 +2333,9 @@
           <w:noProof/>
         </w:rPr>
         <w:drawing>
-          <wp:inline distT="0" distB="0" distL="0" distR="0" wp14:anchorId="6287FB68" wp14:editId="525C19E9">
-            <wp:extent cx="5864205" cy="3829685"/>
-            <wp:effectExtent l="0" t="0" r="0" b="5715"/>
+          <wp:inline distT="0" distB="0" distL="0" distR="0" wp14:anchorId="6287FB68" wp14:editId="344A2A9C">
+            <wp:extent cx="5864205" cy="3829684"/>
+            <wp:effectExtent l="0" t="0" r="3810" b="6350"/>
             <wp:docPr id="562571959" name="Picture 1"/>
             <wp:cNvGraphicFramePr>
               <a:graphicFrameLocks xmlns:a="http://schemas.openxmlformats.org/drawingml/2006/main" noChangeAspect="1"/>
@@ -2037,7 +2362,7 @@
                   <pic:spPr>
                     <a:xfrm>
                       <a:off x="0" y="0"/>
-                      <a:ext cx="5864205" cy="3829685"/>
+                      <a:ext cx="5864205" cy="3829684"/>
                     </a:xfrm>
                     <a:prstGeom prst="rect">
                       <a:avLst/>
@@ -2097,7 +2422,6 @@
         <w:tc>
           <w:tcPr>
             <w:tcW w:w="1520" w:type="dxa"/>
-            <w:shd w:val="clear" w:color="auto" w:fill="auto"/>
             <w:tcMar>
               <w:top w:w="100" w:type="dxa"/>
               <w:left w:w="100" w:type="dxa"/>
@@ -2128,7 +2452,6 @@
         <w:tc>
           <w:tcPr>
             <w:tcW w:w="4950" w:type="dxa"/>
-            <w:shd w:val="clear" w:color="auto" w:fill="auto"/>
             <w:tcMar>
               <w:top w:w="100" w:type="dxa"/>
               <w:left w:w="100" w:type="dxa"/>
@@ -2151,7 +2474,6 @@
         <w:tc>
           <w:tcPr>
             <w:tcW w:w="1520" w:type="dxa"/>
-            <w:shd w:val="clear" w:color="auto" w:fill="auto"/>
             <w:tcMar>
               <w:top w:w="100" w:type="dxa"/>
               <w:left w:w="100" w:type="dxa"/>
@@ -2182,7 +2504,6 @@
         <w:tc>
           <w:tcPr>
             <w:tcW w:w="4950" w:type="dxa"/>
-            <w:shd w:val="clear" w:color="auto" w:fill="auto"/>
             <w:tcMar>
               <w:top w:w="100" w:type="dxa"/>
               <w:left w:w="100" w:type="dxa"/>
@@ -2214,7 +2535,6 @@
         <w:tc>
           <w:tcPr>
             <w:tcW w:w="1520" w:type="dxa"/>
-            <w:shd w:val="clear" w:color="auto" w:fill="auto"/>
             <w:tcMar>
               <w:top w:w="100" w:type="dxa"/>
               <w:left w:w="100" w:type="dxa"/>
@@ -2245,7 +2565,6 @@
         <w:tc>
           <w:tcPr>
             <w:tcW w:w="4950" w:type="dxa"/>
-            <w:shd w:val="clear" w:color="auto" w:fill="auto"/>
             <w:tcMar>
               <w:top w:w="100" w:type="dxa"/>
               <w:left w:w="100" w:type="dxa"/>
@@ -2275,8 +2594,8 @@
           <w:noProof/>
         </w:rPr>
         <w:drawing>
-          <wp:inline distT="0" distB="0" distL="0" distR="0" wp14:anchorId="04A275D5" wp14:editId="04A3794A">
-            <wp:extent cx="5185000" cy="4553693"/>
+          <wp:inline distT="0" distB="0" distL="0" distR="0" wp14:anchorId="04A275D5" wp14:editId="3FD6F38C">
+            <wp:extent cx="5185000" cy="4553692"/>
             <wp:effectExtent l="0" t="0" r="0" b="5715"/>
             <wp:docPr id="83880052" name="Picture 83880052"/>
             <wp:cNvGraphicFramePr>
@@ -2290,7 +2609,7 @@
                     <pic:cNvPicPr/>
                   </pic:nvPicPr>
                   <pic:blipFill>
-                    <a:blip r:embed="rId15">
+                    <a:blip r:embed="rId15" cstate="print">
                       <a:extLst>
                         <a:ext uri="{28A0092B-C50C-407E-A947-70E740481C1C}">
                           <a14:useLocalDpi xmlns:a14="http://schemas.microsoft.com/office/drawing/2010/main" val="0"/>
@@ -2304,7 +2623,7 @@
                   <pic:spPr>
                     <a:xfrm>
                       <a:off x="0" y="0"/>
-                      <a:ext cx="5185000" cy="4553693"/>
+                      <a:ext cx="5185000" cy="4553692"/>
                     </a:xfrm>
                     <a:prstGeom prst="rect">
                       <a:avLst/>
@@ -2947,6 +3266,136 @@
         </w:rPr>
         <w:t xml:space="preserve"> </w:t>
       </w:r>
+    </w:p>
+    <w:p>
+      <w:pPr>
+        <w:numPr>
+          <w:ilvl w:val="0"/>
+          <w:numId w:val="1"/>
+        </w:numPr>
+        <w:ind w:left="360"/>
+        <w:jc w:val="both"/>
+      </w:pPr>
+      <w:r>
+        <w:rPr>
+          <w:b/>
+          <w:bCs/>
+        </w:rPr>
+        <w:t>Currently Used Deprecated Functions Document</w:t>
+      </w:r>
+      <w:r>
+        <w:t xml:space="preserve"> (AVCDL secondary document)</w:t>
+      </w:r>
+    </w:p>
+    <w:p>
+      <w:pPr>
+        <w:numPr>
+          <w:ilvl w:val="0"/>
+          <w:numId w:val="1"/>
+        </w:numPr>
+        <w:ind w:left="360"/>
+        <w:jc w:val="both"/>
+      </w:pPr>
+      <w:r>
+        <w:rPr>
+          <w:b/>
+          <w:bCs/>
+        </w:rPr>
+        <w:t>Static Analysis Report</w:t>
+      </w:r>
+      <w:r>
+        <w:t xml:space="preserve"> (AVCDL secondary document)</w:t>
+      </w:r>
+    </w:p>
+    <w:p>
+      <w:pPr>
+        <w:numPr>
+          <w:ilvl w:val="0"/>
+          <w:numId w:val="1"/>
+        </w:numPr>
+        <w:ind w:left="360"/>
+        <w:jc w:val="both"/>
+      </w:pPr>
+      <w:r>
+        <w:rPr>
+          <w:b/>
+          <w:bCs/>
+        </w:rPr>
+        <w:t>Dynamic</w:t>
+      </w:r>
+      <w:r>
+        <w:rPr>
+          <w:b/>
+          <w:bCs/>
+        </w:rPr>
+        <w:t xml:space="preserve"> Analysis Report</w:t>
+      </w:r>
+      <w:r>
+        <w:t xml:space="preserve"> (AVCDL secondary document)</w:t>
+      </w:r>
+    </w:p>
+    <w:p>
+      <w:pPr>
+        <w:numPr>
+          <w:ilvl w:val="0"/>
+          <w:numId w:val="1"/>
+        </w:numPr>
+        <w:ind w:left="360"/>
+        <w:jc w:val="both"/>
+      </w:pPr>
+      <w:r>
+        <w:rPr>
+          <w:b/>
+          <w:bCs/>
+        </w:rPr>
+        <w:t>Fuzz Testing</w:t>
+      </w:r>
+      <w:r>
+        <w:rPr>
+          <w:b/>
+          <w:bCs/>
+        </w:rPr>
+        <w:t xml:space="preserve"> Report</w:t>
+      </w:r>
+      <w:r>
+        <w:t xml:space="preserve"> (AVCDL secondary document)</w:t>
+      </w:r>
+    </w:p>
+    <w:p>
+      <w:pPr>
+        <w:numPr>
+          <w:ilvl w:val="0"/>
+          <w:numId w:val="1"/>
+        </w:numPr>
+        <w:ind w:left="360"/>
+        <w:jc w:val="both"/>
+      </w:pPr>
+      <w:r>
+        <w:rPr>
+          <w:b/>
+          <w:bCs/>
+        </w:rPr>
+        <w:t>Penetration Testing</w:t>
+      </w:r>
+      <w:r>
+        <w:rPr>
+          <w:b/>
+          <w:bCs/>
+        </w:rPr>
+        <w:t xml:space="preserve"> Report</w:t>
+      </w:r>
+      <w:r>
+        <w:t xml:space="preserve"> (AVCDL secondary document)</w:t>
+      </w:r>
+    </w:p>
+    <w:p>
+      <w:pPr>
+        <w:rPr>
+          <w:b/>
+          <w:bCs/>
+          <w:lang w:val="en-US"/>
+        </w:rPr>
+      </w:pPr>
     </w:p>
     <w:sectPr>
       <w:footerReference w:type="even" r:id="rId22"/>
@@ -2963,7 +3412,7 @@
 </file>
 
 <file path=word/endnotes.xml><?xml version="1.0" encoding="utf-8"?>
-<w:endnotes xmlns:wpc="http://schemas.microsoft.com/office/word/2010/wordprocessingCanvas" xmlns:cx="http://schemas.microsoft.com/office/drawing/2014/chartex" xmlns:cx1="http://schemas.microsoft.com/office/drawing/2015/9/8/chartex" xmlns:cx2="http://schemas.microsoft.com/office/drawing/2015/10/21/chartex" xmlns:cx3="http://schemas.microsoft.com/office/drawing/2016/5/9/chartex" xmlns:cx4="http://schemas.microsoft.com/office/drawing/2016/5/10/chartex" xmlns:cx5="http://schemas.microsoft.com/office/drawing/2016/5/11/chartex" xmlns:cx6="http://schemas.microsoft.com/office/drawing/2016/5/12/chartex" xmlns:cx7="http://schemas.microsoft.com/office/drawing/2016/5/13/chartex" xmlns:cx8="http://schemas.microsoft.com/office/drawing/2016/5/14/chartex" xmlns:mc="http://schemas.openxmlformats.org/markup-compatibility/2006" xmlns:aink="http://schemas.microsoft.com/office/drawing/2016/ink" xmlns:am3d="http://schemas.microsoft.com/office/drawing/2017/model3d" xmlns:o="urn:schemas-microsoft-com:office:office" xmlns:oel="http://schemas.microsoft.com/office/2019/extlst" xmlns:r="http://schemas.openxmlformats.org/officeDocument/2006/relationships" xmlns:m="http://schemas.openxmlformats.org/officeDocument/2006/math" xmlns:v="urn:schemas-microsoft-com:vml" xmlns:wp14="http://schemas.microsoft.com/office/word/2010/wordprocessingDrawing" xmlns:wp="http://schemas.openxmlformats.org/drawingml/2006/wordprocessingDrawing" xmlns:w10="urn:schemas-microsoft-com:office:word" xmlns:w="http://schemas.openxmlformats.org/wordprocessingml/2006/main" xmlns:w14="http://schemas.microsoft.com/office/word/2010/wordml" xmlns:w15="http://schemas.microsoft.com/office/word/2012/wordml" xmlns:w16cex="http://schemas.microsoft.com/office/word/2018/wordml/cex" xmlns:w16cid="http://schemas.microsoft.com/office/word/2016/wordml/cid" xmlns:w16="http://schemas.microsoft.com/office/word/2018/wordml" xmlns:w16sdtdh="http://schemas.microsoft.com/office/word/2020/wordml/sdtdatahash" xmlns:w16se="http://schemas.microsoft.com/office/word/2015/wordml/symex" xmlns:wpg="http://schemas.microsoft.com/office/word/2010/wordprocessingGroup" xmlns:wpi="http://schemas.microsoft.com/office/word/2010/wordprocessingInk" xmlns:wne="http://schemas.microsoft.com/office/word/2006/wordml" xmlns:wps="http://schemas.microsoft.com/office/word/2010/wordprocessingShape" mc:Ignorable="w14 w15 w16se w16cid w16 w16cex w16sdtdh wp14">
+<w:endnotes xmlns:wpc="http://schemas.microsoft.com/office/word/2010/wordprocessingCanvas" xmlns:cx="http://schemas.microsoft.com/office/drawing/2014/chartex" xmlns:cx1="http://schemas.microsoft.com/office/drawing/2015/9/8/chartex" xmlns:cx2="http://schemas.microsoft.com/office/drawing/2015/10/21/chartex" xmlns:cx3="http://schemas.microsoft.com/office/drawing/2016/5/9/chartex" xmlns:cx4="http://schemas.microsoft.com/office/drawing/2016/5/10/chartex" xmlns:cx5="http://schemas.microsoft.com/office/drawing/2016/5/11/chartex" xmlns:cx6="http://schemas.microsoft.com/office/drawing/2016/5/12/chartex" xmlns:cx7="http://schemas.microsoft.com/office/drawing/2016/5/13/chartex" xmlns:cx8="http://schemas.microsoft.com/office/drawing/2016/5/14/chartex" xmlns:mc="http://schemas.openxmlformats.org/markup-compatibility/2006" xmlns:aink="http://schemas.microsoft.com/office/drawing/2016/ink" xmlns:am3d="http://schemas.microsoft.com/office/drawing/2017/model3d" xmlns:o="urn:schemas-microsoft-com:office:office" xmlns:oel="http://schemas.microsoft.com/office/2019/extlst" xmlns:r="http://schemas.openxmlformats.org/officeDocument/2006/relationships" xmlns:m="http://schemas.openxmlformats.org/officeDocument/2006/math" xmlns:v="urn:schemas-microsoft-com:vml" xmlns:wp14="http://schemas.microsoft.com/office/word/2010/wordprocessingDrawing" xmlns:wp="http://schemas.openxmlformats.org/drawingml/2006/wordprocessingDrawing" xmlns:w10="urn:schemas-microsoft-com:office:word" xmlns:w="http://schemas.openxmlformats.org/wordprocessingml/2006/main" xmlns:w14="http://schemas.microsoft.com/office/word/2010/wordml" xmlns:w15="http://schemas.microsoft.com/office/word/2012/wordml" xmlns:w16cex="http://schemas.microsoft.com/office/word/2018/wordml/cex" xmlns:w16cid="http://schemas.microsoft.com/office/word/2016/wordml/cid" xmlns:w16="http://schemas.microsoft.com/office/word/2018/wordml" xmlns:w16du="http://schemas.microsoft.com/office/word/2023/wordml/word16du" xmlns:w16sdtdh="http://schemas.microsoft.com/office/word/2020/wordml/sdtdatahash" xmlns:w16sdtfl="http://schemas.microsoft.com/office/word/2024/wordml/sdtformatlock" xmlns:w16se="http://schemas.microsoft.com/office/word/2015/wordml/symex" xmlns:wpg="http://schemas.microsoft.com/office/word/2010/wordprocessingGroup" xmlns:wpi="http://schemas.microsoft.com/office/word/2010/wordprocessingInk" xmlns:wne="http://schemas.microsoft.com/office/word/2006/wordml" xmlns:wps="http://schemas.microsoft.com/office/word/2010/wordprocessingShape" mc:Ignorable="w14 w15 w16se w16cid w16 w16cex w16sdtdh w16sdtfl w16du wp14">
   <w:endnote w:type="separator" w:id="-1">
     <w:p>
       <w:pPr>
@@ -2988,7 +3437,7 @@
 </file>
 
 <file path=word/footer1.xml><?xml version="1.0" encoding="utf-8"?>
-<w:ftr xmlns:wpc="http://schemas.microsoft.com/office/word/2010/wordprocessingCanvas" xmlns:cx="http://schemas.microsoft.com/office/drawing/2014/chartex" xmlns:cx1="http://schemas.microsoft.com/office/drawing/2015/9/8/chartex" xmlns:cx2="http://schemas.microsoft.com/office/drawing/2015/10/21/chartex" xmlns:cx3="http://schemas.microsoft.com/office/drawing/2016/5/9/chartex" xmlns:cx4="http://schemas.microsoft.com/office/drawing/2016/5/10/chartex" xmlns:cx5="http://schemas.microsoft.com/office/drawing/2016/5/11/chartex" xmlns:cx6="http://schemas.microsoft.com/office/drawing/2016/5/12/chartex" xmlns:cx7="http://schemas.microsoft.com/office/drawing/2016/5/13/chartex" xmlns:cx8="http://schemas.microsoft.com/office/drawing/2016/5/14/chartex" xmlns:mc="http://schemas.openxmlformats.org/markup-compatibility/2006" xmlns:aink="http://schemas.microsoft.com/office/drawing/2016/ink" xmlns:am3d="http://schemas.microsoft.com/office/drawing/2017/model3d" xmlns:o="urn:schemas-microsoft-com:office:office" xmlns:oel="http://schemas.microsoft.com/office/2019/extlst" xmlns:r="http://schemas.openxmlformats.org/officeDocument/2006/relationships" xmlns:m="http://schemas.openxmlformats.org/officeDocument/2006/math" xmlns:v="urn:schemas-microsoft-com:vml" xmlns:wp14="http://schemas.microsoft.com/office/word/2010/wordprocessingDrawing" xmlns:wp="http://schemas.openxmlformats.org/drawingml/2006/wordprocessingDrawing" xmlns:w10="urn:schemas-microsoft-com:office:word" xmlns:w="http://schemas.openxmlformats.org/wordprocessingml/2006/main" xmlns:w14="http://schemas.microsoft.com/office/word/2010/wordml" xmlns:w15="http://schemas.microsoft.com/office/word/2012/wordml" xmlns:w16cex="http://schemas.microsoft.com/office/word/2018/wordml/cex" xmlns:w16cid="http://schemas.microsoft.com/office/word/2016/wordml/cid" xmlns:w16="http://schemas.microsoft.com/office/word/2018/wordml" xmlns:w16sdtdh="http://schemas.microsoft.com/office/word/2020/wordml/sdtdatahash" xmlns:w16se="http://schemas.microsoft.com/office/word/2015/wordml/symex" xmlns:wpg="http://schemas.microsoft.com/office/word/2010/wordprocessingGroup" xmlns:wpi="http://schemas.microsoft.com/office/word/2010/wordprocessingInk" xmlns:wne="http://schemas.microsoft.com/office/word/2006/wordml" xmlns:wps="http://schemas.microsoft.com/office/word/2010/wordprocessingShape" mc:Ignorable="w14 w15 w16se w16cid w16 w16cex w16sdtdh wp14">
+<w:ftr xmlns:wpc="http://schemas.microsoft.com/office/word/2010/wordprocessingCanvas" xmlns:cx="http://schemas.microsoft.com/office/drawing/2014/chartex" xmlns:cx1="http://schemas.microsoft.com/office/drawing/2015/9/8/chartex" xmlns:cx2="http://schemas.microsoft.com/office/drawing/2015/10/21/chartex" xmlns:cx3="http://schemas.microsoft.com/office/drawing/2016/5/9/chartex" xmlns:cx4="http://schemas.microsoft.com/office/drawing/2016/5/10/chartex" xmlns:cx5="http://schemas.microsoft.com/office/drawing/2016/5/11/chartex" xmlns:cx6="http://schemas.microsoft.com/office/drawing/2016/5/12/chartex" xmlns:cx7="http://schemas.microsoft.com/office/drawing/2016/5/13/chartex" xmlns:cx8="http://schemas.microsoft.com/office/drawing/2016/5/14/chartex" xmlns:mc="http://schemas.openxmlformats.org/markup-compatibility/2006" xmlns:aink="http://schemas.microsoft.com/office/drawing/2016/ink" xmlns:am3d="http://schemas.microsoft.com/office/drawing/2017/model3d" xmlns:o="urn:schemas-microsoft-com:office:office" xmlns:oel="http://schemas.microsoft.com/office/2019/extlst" xmlns:r="http://schemas.openxmlformats.org/officeDocument/2006/relationships" xmlns:m="http://schemas.openxmlformats.org/officeDocument/2006/math" xmlns:v="urn:schemas-microsoft-com:vml" xmlns:wp14="http://schemas.microsoft.com/office/word/2010/wordprocessingDrawing" xmlns:wp="http://schemas.openxmlformats.org/drawingml/2006/wordprocessingDrawing" xmlns:w10="urn:schemas-microsoft-com:office:word" xmlns:w="http://schemas.openxmlformats.org/wordprocessingml/2006/main" xmlns:w14="http://schemas.microsoft.com/office/word/2010/wordml" xmlns:w15="http://schemas.microsoft.com/office/word/2012/wordml" xmlns:w16cex="http://schemas.microsoft.com/office/word/2018/wordml/cex" xmlns:w16cid="http://schemas.microsoft.com/office/word/2016/wordml/cid" xmlns:w16="http://schemas.microsoft.com/office/word/2018/wordml" xmlns:w16du="http://schemas.microsoft.com/office/word/2023/wordml/word16du" xmlns:w16sdtdh="http://schemas.microsoft.com/office/word/2020/wordml/sdtdatahash" xmlns:w16sdtfl="http://schemas.microsoft.com/office/word/2024/wordml/sdtformatlock" xmlns:w16se="http://schemas.microsoft.com/office/word/2015/wordml/symex" xmlns:wpg="http://schemas.microsoft.com/office/word/2010/wordprocessingGroup" xmlns:wpi="http://schemas.microsoft.com/office/word/2010/wordprocessingInk" xmlns:wne="http://schemas.microsoft.com/office/word/2006/wordml" xmlns:wps="http://schemas.microsoft.com/office/word/2010/wordprocessingShape" mc:Ignorable="w14 w15 w16se w16cid w16 w16cex w16sdtdh w16sdtfl w16du wp14">
   <w:sdt>
     <w:sdtPr>
       <w:rPr>
@@ -3053,7 +3502,7 @@
 </file>
 
 <file path=word/footer2.xml><?xml version="1.0" encoding="utf-8"?>
-<w:ftr xmlns:wpc="http://schemas.microsoft.com/office/word/2010/wordprocessingCanvas" xmlns:cx="http://schemas.microsoft.com/office/drawing/2014/chartex" xmlns:cx1="http://schemas.microsoft.com/office/drawing/2015/9/8/chartex" xmlns:cx2="http://schemas.microsoft.com/office/drawing/2015/10/21/chartex" xmlns:cx3="http://schemas.microsoft.com/office/drawing/2016/5/9/chartex" xmlns:cx4="http://schemas.microsoft.com/office/drawing/2016/5/10/chartex" xmlns:cx5="http://schemas.microsoft.com/office/drawing/2016/5/11/chartex" xmlns:cx6="http://schemas.microsoft.com/office/drawing/2016/5/12/chartex" xmlns:cx7="http://schemas.microsoft.com/office/drawing/2016/5/13/chartex" xmlns:cx8="http://schemas.microsoft.com/office/drawing/2016/5/14/chartex" xmlns:mc="http://schemas.openxmlformats.org/markup-compatibility/2006" xmlns:aink="http://schemas.microsoft.com/office/drawing/2016/ink" xmlns:am3d="http://schemas.microsoft.com/office/drawing/2017/model3d" xmlns:o="urn:schemas-microsoft-com:office:office" xmlns:oel="http://schemas.microsoft.com/office/2019/extlst" xmlns:r="http://schemas.openxmlformats.org/officeDocument/2006/relationships" xmlns:m="http://schemas.openxmlformats.org/officeDocument/2006/math" xmlns:v="urn:schemas-microsoft-com:vml" xmlns:wp14="http://schemas.microsoft.com/office/word/2010/wordprocessingDrawing" xmlns:wp="http://schemas.openxmlformats.org/drawingml/2006/wordprocessingDrawing" xmlns:w10="urn:schemas-microsoft-com:office:word" xmlns:w="http://schemas.openxmlformats.org/wordprocessingml/2006/main" xmlns:w14="http://schemas.microsoft.com/office/word/2010/wordml" xmlns:w15="http://schemas.microsoft.com/office/word/2012/wordml" xmlns:w16cex="http://schemas.microsoft.com/office/word/2018/wordml/cex" xmlns:w16cid="http://schemas.microsoft.com/office/word/2016/wordml/cid" xmlns:w16="http://schemas.microsoft.com/office/word/2018/wordml" xmlns:w16sdtdh="http://schemas.microsoft.com/office/word/2020/wordml/sdtdatahash" xmlns:w16se="http://schemas.microsoft.com/office/word/2015/wordml/symex" xmlns:wpg="http://schemas.microsoft.com/office/word/2010/wordprocessingGroup" xmlns:wpi="http://schemas.microsoft.com/office/word/2010/wordprocessingInk" xmlns:wne="http://schemas.microsoft.com/office/word/2006/wordml" xmlns:wps="http://schemas.microsoft.com/office/word/2010/wordprocessingShape" mc:Ignorable="w14 w15 w16se w16cid w16 w16cex w16sdtdh wp14">
+<w:ftr xmlns:wpc="http://schemas.microsoft.com/office/word/2010/wordprocessingCanvas" xmlns:cx="http://schemas.microsoft.com/office/drawing/2014/chartex" xmlns:cx1="http://schemas.microsoft.com/office/drawing/2015/9/8/chartex" xmlns:cx2="http://schemas.microsoft.com/office/drawing/2015/10/21/chartex" xmlns:cx3="http://schemas.microsoft.com/office/drawing/2016/5/9/chartex" xmlns:cx4="http://schemas.microsoft.com/office/drawing/2016/5/10/chartex" xmlns:cx5="http://schemas.microsoft.com/office/drawing/2016/5/11/chartex" xmlns:cx6="http://schemas.microsoft.com/office/drawing/2016/5/12/chartex" xmlns:cx7="http://schemas.microsoft.com/office/drawing/2016/5/13/chartex" xmlns:cx8="http://schemas.microsoft.com/office/drawing/2016/5/14/chartex" xmlns:mc="http://schemas.openxmlformats.org/markup-compatibility/2006" xmlns:aink="http://schemas.microsoft.com/office/drawing/2016/ink" xmlns:am3d="http://schemas.microsoft.com/office/drawing/2017/model3d" xmlns:o="urn:schemas-microsoft-com:office:office" xmlns:oel="http://schemas.microsoft.com/office/2019/extlst" xmlns:r="http://schemas.openxmlformats.org/officeDocument/2006/relationships" xmlns:m="http://schemas.openxmlformats.org/officeDocument/2006/math" xmlns:v="urn:schemas-microsoft-com:vml" xmlns:wp14="http://schemas.microsoft.com/office/word/2010/wordprocessingDrawing" xmlns:wp="http://schemas.openxmlformats.org/drawingml/2006/wordprocessingDrawing" xmlns:w10="urn:schemas-microsoft-com:office:word" xmlns:w="http://schemas.openxmlformats.org/wordprocessingml/2006/main" xmlns:w14="http://schemas.microsoft.com/office/word/2010/wordml" xmlns:w15="http://schemas.microsoft.com/office/word/2012/wordml" xmlns:w16cex="http://schemas.microsoft.com/office/word/2018/wordml/cex" xmlns:w16cid="http://schemas.microsoft.com/office/word/2016/wordml/cid" xmlns:w16="http://schemas.microsoft.com/office/word/2018/wordml" xmlns:w16du="http://schemas.microsoft.com/office/word/2023/wordml/word16du" xmlns:w16sdtdh="http://schemas.microsoft.com/office/word/2020/wordml/sdtdatahash" xmlns:w16sdtfl="http://schemas.microsoft.com/office/word/2024/wordml/sdtformatlock" xmlns:w16se="http://schemas.microsoft.com/office/word/2015/wordml/symex" xmlns:wpg="http://schemas.microsoft.com/office/word/2010/wordprocessingGroup" xmlns:wpi="http://schemas.microsoft.com/office/word/2010/wordprocessingInk" xmlns:wne="http://schemas.microsoft.com/office/word/2006/wordml" xmlns:wps="http://schemas.microsoft.com/office/word/2010/wordprocessingShape" mc:Ignorable="w14 w15 w16se w16cid w16 w16cex w16sdtdh w16sdtfl w16du wp14">
   <w:sdt>
     <w:sdtPr>
       <w:rPr>
@@ -3118,7 +3567,7 @@
 </file>
 
 <file path=word/footnotes.xml><?xml version="1.0" encoding="utf-8"?>
-<w:footnotes xmlns:wpc="http://schemas.microsoft.com/office/word/2010/wordprocessingCanvas" xmlns:cx="http://schemas.microsoft.com/office/drawing/2014/chartex" xmlns:cx1="http://schemas.microsoft.com/office/drawing/2015/9/8/chartex" xmlns:cx2="http://schemas.microsoft.com/office/drawing/2015/10/21/chartex" xmlns:cx3="http://schemas.microsoft.com/office/drawing/2016/5/9/chartex" xmlns:cx4="http://schemas.microsoft.com/office/drawing/2016/5/10/chartex" xmlns:cx5="http://schemas.microsoft.com/office/drawing/2016/5/11/chartex" xmlns:cx6="http://schemas.microsoft.com/office/drawing/2016/5/12/chartex" xmlns:cx7="http://schemas.microsoft.com/office/drawing/2016/5/13/chartex" xmlns:cx8="http://schemas.microsoft.com/office/drawing/2016/5/14/chartex" xmlns:mc="http://schemas.openxmlformats.org/markup-compatibility/2006" xmlns:aink="http://schemas.microsoft.com/office/drawing/2016/ink" xmlns:am3d="http://schemas.microsoft.com/office/drawing/2017/model3d" xmlns:o="urn:schemas-microsoft-com:office:office" xmlns:oel="http://schemas.microsoft.com/office/2019/extlst" xmlns:r="http://schemas.openxmlformats.org/officeDocument/2006/relationships" xmlns:m="http://schemas.openxmlformats.org/officeDocument/2006/math" xmlns:v="urn:schemas-microsoft-com:vml" xmlns:wp14="http://schemas.microsoft.com/office/word/2010/wordprocessingDrawing" xmlns:wp="http://schemas.openxmlformats.org/drawingml/2006/wordprocessingDrawing" xmlns:w10="urn:schemas-microsoft-com:office:word" xmlns:w="http://schemas.openxmlformats.org/wordprocessingml/2006/main" xmlns:w14="http://schemas.microsoft.com/office/word/2010/wordml" xmlns:w15="http://schemas.microsoft.com/office/word/2012/wordml" xmlns:w16cex="http://schemas.microsoft.com/office/word/2018/wordml/cex" xmlns:w16cid="http://schemas.microsoft.com/office/word/2016/wordml/cid" xmlns:w16="http://schemas.microsoft.com/office/word/2018/wordml" xmlns:w16sdtdh="http://schemas.microsoft.com/office/word/2020/wordml/sdtdatahash" xmlns:w16se="http://schemas.microsoft.com/office/word/2015/wordml/symex" xmlns:wpg="http://schemas.microsoft.com/office/word/2010/wordprocessingGroup" xmlns:wpi="http://schemas.microsoft.com/office/word/2010/wordprocessingInk" xmlns:wne="http://schemas.microsoft.com/office/word/2006/wordml" xmlns:wps="http://schemas.microsoft.com/office/word/2010/wordprocessingShape" mc:Ignorable="w14 w15 w16se w16cid w16 w16cex w16sdtdh wp14">
+<w:footnotes xmlns:wpc="http://schemas.microsoft.com/office/word/2010/wordprocessingCanvas" xmlns:cx="http://schemas.microsoft.com/office/drawing/2014/chartex" xmlns:cx1="http://schemas.microsoft.com/office/drawing/2015/9/8/chartex" xmlns:cx2="http://schemas.microsoft.com/office/drawing/2015/10/21/chartex" xmlns:cx3="http://schemas.microsoft.com/office/drawing/2016/5/9/chartex" xmlns:cx4="http://schemas.microsoft.com/office/drawing/2016/5/10/chartex" xmlns:cx5="http://schemas.microsoft.com/office/drawing/2016/5/11/chartex" xmlns:cx6="http://schemas.microsoft.com/office/drawing/2016/5/12/chartex" xmlns:cx7="http://schemas.microsoft.com/office/drawing/2016/5/13/chartex" xmlns:cx8="http://schemas.microsoft.com/office/drawing/2016/5/14/chartex" xmlns:mc="http://schemas.openxmlformats.org/markup-compatibility/2006" xmlns:aink="http://schemas.microsoft.com/office/drawing/2016/ink" xmlns:am3d="http://schemas.microsoft.com/office/drawing/2017/model3d" xmlns:o="urn:schemas-microsoft-com:office:office" xmlns:oel="http://schemas.microsoft.com/office/2019/extlst" xmlns:r="http://schemas.openxmlformats.org/officeDocument/2006/relationships" xmlns:m="http://schemas.openxmlformats.org/officeDocument/2006/math" xmlns:v="urn:schemas-microsoft-com:vml" xmlns:wp14="http://schemas.microsoft.com/office/word/2010/wordprocessingDrawing" xmlns:wp="http://schemas.openxmlformats.org/drawingml/2006/wordprocessingDrawing" xmlns:w10="urn:schemas-microsoft-com:office:word" xmlns:w="http://schemas.openxmlformats.org/wordprocessingml/2006/main" xmlns:w14="http://schemas.microsoft.com/office/word/2010/wordml" xmlns:w15="http://schemas.microsoft.com/office/word/2012/wordml" xmlns:w16cex="http://schemas.microsoft.com/office/word/2018/wordml/cex" xmlns:w16cid="http://schemas.microsoft.com/office/word/2016/wordml/cid" xmlns:w16="http://schemas.microsoft.com/office/word/2018/wordml" xmlns:w16du="http://schemas.microsoft.com/office/word/2023/wordml/word16du" xmlns:w16sdtdh="http://schemas.microsoft.com/office/word/2020/wordml/sdtdatahash" xmlns:w16sdtfl="http://schemas.microsoft.com/office/word/2024/wordml/sdtformatlock" xmlns:w16se="http://schemas.microsoft.com/office/word/2015/wordml/symex" xmlns:wpg="http://schemas.microsoft.com/office/word/2010/wordprocessingGroup" xmlns:wpi="http://schemas.microsoft.com/office/word/2010/wordprocessingInk" xmlns:wne="http://schemas.microsoft.com/office/word/2006/wordml" xmlns:wps="http://schemas.microsoft.com/office/word/2010/wordprocessingShape" mc:Ignorable="w14 w15 w16se w16cid w16 w16cex w16sdtdh w16sdtfl w16du wp14">
   <w:footnote w:type="separator" w:id="-1">
     <w:p>
       <w:pPr>
@@ -3143,7 +3592,7 @@
 </file>
 
 <file path=word/header1.xml><?xml version="1.0" encoding="utf-8"?>
-<w:hdr xmlns:wpc="http://schemas.microsoft.com/office/word/2010/wordprocessingCanvas" xmlns:cx="http://schemas.microsoft.com/office/drawing/2014/chartex" xmlns:cx1="http://schemas.microsoft.com/office/drawing/2015/9/8/chartex" xmlns:cx2="http://schemas.microsoft.com/office/drawing/2015/10/21/chartex" xmlns:cx3="http://schemas.microsoft.com/office/drawing/2016/5/9/chartex" xmlns:cx4="http://schemas.microsoft.com/office/drawing/2016/5/10/chartex" xmlns:cx5="http://schemas.microsoft.com/office/drawing/2016/5/11/chartex" xmlns:cx6="http://schemas.microsoft.com/office/drawing/2016/5/12/chartex" xmlns:cx7="http://schemas.microsoft.com/office/drawing/2016/5/13/chartex" xmlns:cx8="http://schemas.microsoft.com/office/drawing/2016/5/14/chartex" xmlns:mc="http://schemas.openxmlformats.org/markup-compatibility/2006" xmlns:aink="http://schemas.microsoft.com/office/drawing/2016/ink" xmlns:am3d="http://schemas.microsoft.com/office/drawing/2017/model3d" xmlns:o="urn:schemas-microsoft-com:office:office" xmlns:oel="http://schemas.microsoft.com/office/2019/extlst" xmlns:r="http://schemas.openxmlformats.org/officeDocument/2006/relationships" xmlns:m="http://schemas.openxmlformats.org/officeDocument/2006/math" xmlns:v="urn:schemas-microsoft-com:vml" xmlns:wp14="http://schemas.microsoft.com/office/word/2010/wordprocessingDrawing" xmlns:wp="http://schemas.openxmlformats.org/drawingml/2006/wordprocessingDrawing" xmlns:w10="urn:schemas-microsoft-com:office:word" xmlns:w="http://schemas.openxmlformats.org/wordprocessingml/2006/main" xmlns:w14="http://schemas.microsoft.com/office/word/2010/wordml" xmlns:w15="http://schemas.microsoft.com/office/word/2012/wordml" xmlns:w16cex="http://schemas.microsoft.com/office/word/2018/wordml/cex" xmlns:w16cid="http://schemas.microsoft.com/office/word/2016/wordml/cid" xmlns:w16="http://schemas.microsoft.com/office/word/2018/wordml" xmlns:w16sdtdh="http://schemas.microsoft.com/office/word/2020/wordml/sdtdatahash" xmlns:w16se="http://schemas.microsoft.com/office/word/2015/wordml/symex" xmlns:wpg="http://schemas.microsoft.com/office/word/2010/wordprocessingGroup" xmlns:wpi="http://schemas.microsoft.com/office/word/2010/wordprocessingInk" xmlns:wne="http://schemas.microsoft.com/office/word/2006/wordml" xmlns:wps="http://schemas.microsoft.com/office/word/2010/wordprocessingShape" mc:Ignorable="w14 w15 w16se w16cid w16 w16cex w16sdtdh wp14">
+<w:hdr xmlns:wpc="http://schemas.microsoft.com/office/word/2010/wordprocessingCanvas" xmlns:cx="http://schemas.microsoft.com/office/drawing/2014/chartex" xmlns:cx1="http://schemas.microsoft.com/office/drawing/2015/9/8/chartex" xmlns:cx2="http://schemas.microsoft.com/office/drawing/2015/10/21/chartex" xmlns:cx3="http://schemas.microsoft.com/office/drawing/2016/5/9/chartex" xmlns:cx4="http://schemas.microsoft.com/office/drawing/2016/5/10/chartex" xmlns:cx5="http://schemas.microsoft.com/office/drawing/2016/5/11/chartex" xmlns:cx6="http://schemas.microsoft.com/office/drawing/2016/5/12/chartex" xmlns:cx7="http://schemas.microsoft.com/office/drawing/2016/5/13/chartex" xmlns:cx8="http://schemas.microsoft.com/office/drawing/2016/5/14/chartex" xmlns:mc="http://schemas.openxmlformats.org/markup-compatibility/2006" xmlns:aink="http://schemas.microsoft.com/office/drawing/2016/ink" xmlns:am3d="http://schemas.microsoft.com/office/drawing/2017/model3d" xmlns:o="urn:schemas-microsoft-com:office:office" xmlns:oel="http://schemas.microsoft.com/office/2019/extlst" xmlns:r="http://schemas.openxmlformats.org/officeDocument/2006/relationships" xmlns:m="http://schemas.openxmlformats.org/officeDocument/2006/math" xmlns:v="urn:schemas-microsoft-com:vml" xmlns:wp14="http://schemas.microsoft.com/office/word/2010/wordprocessingDrawing" xmlns:wp="http://schemas.openxmlformats.org/drawingml/2006/wordprocessingDrawing" xmlns:w10="urn:schemas-microsoft-com:office:word" xmlns:w="http://schemas.openxmlformats.org/wordprocessingml/2006/main" xmlns:w14="http://schemas.microsoft.com/office/word/2010/wordml" xmlns:w15="http://schemas.microsoft.com/office/word/2012/wordml" xmlns:w16cex="http://schemas.microsoft.com/office/word/2018/wordml/cex" xmlns:w16cid="http://schemas.microsoft.com/office/word/2016/wordml/cid" xmlns:w16="http://schemas.microsoft.com/office/word/2018/wordml" xmlns:w16du="http://schemas.microsoft.com/office/word/2023/wordml/word16du" xmlns:w16sdtdh="http://schemas.microsoft.com/office/word/2020/wordml/sdtdatahash" xmlns:w16sdtfl="http://schemas.microsoft.com/office/word/2024/wordml/sdtformatlock" xmlns:w16se="http://schemas.microsoft.com/office/word/2015/wordml/symex" xmlns:wpg="http://schemas.microsoft.com/office/word/2010/wordprocessingGroup" xmlns:wpi="http://schemas.microsoft.com/office/word/2010/wordprocessingInk" xmlns:wne="http://schemas.microsoft.com/office/word/2006/wordml" xmlns:wps="http://schemas.microsoft.com/office/word/2010/wordprocessingShape" mc:Ignorable="w14 w15 w16se w16cid w16 w16cex w16sdtdh w16sdtfl w16du wp14">
   <w:p>
     <w:pPr>
       <w:pStyle w:val="Header"/>
@@ -3160,7 +3609,7 @@
 </file>
 
 <file path=word/numbering.xml><?xml version="1.0" encoding="utf-8"?>
-<w:numbering xmlns:wpc="http://schemas.microsoft.com/office/word/2010/wordprocessingCanvas" xmlns:cx="http://schemas.microsoft.com/office/drawing/2014/chartex" xmlns:cx1="http://schemas.microsoft.com/office/drawing/2015/9/8/chartex" xmlns:cx2="http://schemas.microsoft.com/office/drawing/2015/10/21/chartex" xmlns:cx3="http://schemas.microsoft.com/office/drawing/2016/5/9/chartex" xmlns:cx4="http://schemas.microsoft.com/office/drawing/2016/5/10/chartex" xmlns:cx5="http://schemas.microsoft.com/office/drawing/2016/5/11/chartex" xmlns:cx6="http://schemas.microsoft.com/office/drawing/2016/5/12/chartex" xmlns:cx7="http://schemas.microsoft.com/office/drawing/2016/5/13/chartex" xmlns:cx8="http://schemas.microsoft.com/office/drawing/2016/5/14/chartex" xmlns:mc="http://schemas.openxmlformats.org/markup-compatibility/2006" xmlns:aink="http://schemas.microsoft.com/office/drawing/2016/ink" xmlns:am3d="http://schemas.microsoft.com/office/drawing/2017/model3d" xmlns:o="urn:schemas-microsoft-com:office:office" xmlns:oel="http://schemas.microsoft.com/office/2019/extlst" xmlns:r="http://schemas.openxmlformats.org/officeDocument/2006/relationships" xmlns:m="http://schemas.openxmlformats.org/officeDocument/2006/math" xmlns:v="urn:schemas-microsoft-com:vml" xmlns:wp14="http://schemas.microsoft.com/office/word/2010/wordprocessingDrawing" xmlns:wp="http://schemas.openxmlformats.org/drawingml/2006/wordprocessingDrawing" xmlns:w10="urn:schemas-microsoft-com:office:word" xmlns:w="http://schemas.openxmlformats.org/wordprocessingml/2006/main" xmlns:w14="http://schemas.microsoft.com/office/word/2010/wordml" xmlns:w15="http://schemas.microsoft.com/office/word/2012/wordml" xmlns:w16cex="http://schemas.microsoft.com/office/word/2018/wordml/cex" xmlns:w16cid="http://schemas.microsoft.com/office/word/2016/wordml/cid" xmlns:w16="http://schemas.microsoft.com/office/word/2018/wordml" xmlns:w16sdtdh="http://schemas.microsoft.com/office/word/2020/wordml/sdtdatahash" xmlns:w16se="http://schemas.microsoft.com/office/word/2015/wordml/symex" xmlns:wpg="http://schemas.microsoft.com/office/word/2010/wordprocessingGroup" xmlns:wpi="http://schemas.microsoft.com/office/word/2010/wordprocessingInk" xmlns:wne="http://schemas.microsoft.com/office/word/2006/wordml" xmlns:wps="http://schemas.microsoft.com/office/word/2010/wordprocessingShape" mc:Ignorable="w14 w15 w16se w16cid w16 w16cex w16sdtdh wp14">
+<w:numbering xmlns:wpc="http://schemas.microsoft.com/office/word/2010/wordprocessingCanvas" xmlns:cx="http://schemas.microsoft.com/office/drawing/2014/chartex" xmlns:cx1="http://schemas.microsoft.com/office/drawing/2015/9/8/chartex" xmlns:cx2="http://schemas.microsoft.com/office/drawing/2015/10/21/chartex" xmlns:cx3="http://schemas.microsoft.com/office/drawing/2016/5/9/chartex" xmlns:cx4="http://schemas.microsoft.com/office/drawing/2016/5/10/chartex" xmlns:cx5="http://schemas.microsoft.com/office/drawing/2016/5/11/chartex" xmlns:cx6="http://schemas.microsoft.com/office/drawing/2016/5/12/chartex" xmlns:cx7="http://schemas.microsoft.com/office/drawing/2016/5/13/chartex" xmlns:cx8="http://schemas.microsoft.com/office/drawing/2016/5/14/chartex" xmlns:mc="http://schemas.openxmlformats.org/markup-compatibility/2006" xmlns:aink="http://schemas.microsoft.com/office/drawing/2016/ink" xmlns:am3d="http://schemas.microsoft.com/office/drawing/2017/model3d" xmlns:o="urn:schemas-microsoft-com:office:office" xmlns:oel="http://schemas.microsoft.com/office/2019/extlst" xmlns:r="http://schemas.openxmlformats.org/officeDocument/2006/relationships" xmlns:m="http://schemas.openxmlformats.org/officeDocument/2006/math" xmlns:v="urn:schemas-microsoft-com:vml" xmlns:wp14="http://schemas.microsoft.com/office/word/2010/wordprocessingDrawing" xmlns:wp="http://schemas.openxmlformats.org/drawingml/2006/wordprocessingDrawing" xmlns:w10="urn:schemas-microsoft-com:office:word" xmlns:w="http://schemas.openxmlformats.org/wordprocessingml/2006/main" xmlns:w14="http://schemas.microsoft.com/office/word/2010/wordml" xmlns:w15="http://schemas.microsoft.com/office/word/2012/wordml" xmlns:w16cex="http://schemas.microsoft.com/office/word/2018/wordml/cex" xmlns:w16cid="http://schemas.microsoft.com/office/word/2016/wordml/cid" xmlns:w16="http://schemas.microsoft.com/office/word/2018/wordml" xmlns:w16du="http://schemas.microsoft.com/office/word/2023/wordml/word16du" xmlns:w16sdtdh="http://schemas.microsoft.com/office/word/2020/wordml/sdtdatahash" xmlns:w16sdtfl="http://schemas.microsoft.com/office/word/2024/wordml/sdtformatlock" xmlns:w16se="http://schemas.microsoft.com/office/word/2015/wordml/symex" xmlns:wpg="http://schemas.microsoft.com/office/word/2010/wordprocessingGroup" xmlns:wpi="http://schemas.microsoft.com/office/word/2010/wordprocessingInk" xmlns:wne="http://schemas.microsoft.com/office/word/2006/wordml" xmlns:wps="http://schemas.microsoft.com/office/word/2010/wordprocessingShape" mc:Ignorable="w14 w15 w16se w16cid w16 w16cex w16sdtdh w16sdtfl w16du wp14">
   <w:abstractNum w:abstractNumId="0" w15:restartNumberingAfterBreak="0">
     <w:nsid w:val="16F03ACD"/>
     <w:multiLevelType w:val="multilevel"/>
@@ -3746,7 +4195,7 @@
 </file>
 
 <file path=word/styles.xml><?xml version="1.0" encoding="utf-8"?>
-<w:styles xmlns:mc="http://schemas.openxmlformats.org/markup-compatibility/2006" xmlns:r="http://schemas.openxmlformats.org/officeDocument/2006/relationships" xmlns:w="http://schemas.openxmlformats.org/wordprocessingml/2006/main" xmlns:w14="http://schemas.microsoft.com/office/word/2010/wordml" xmlns:w15="http://schemas.microsoft.com/office/word/2012/wordml" xmlns:w16cex="http://schemas.microsoft.com/office/word/2018/wordml/cex" xmlns:w16cid="http://schemas.microsoft.com/office/word/2016/wordml/cid" xmlns:w16="http://schemas.microsoft.com/office/word/2018/wordml" xmlns:w16sdtdh="http://schemas.microsoft.com/office/word/2020/wordml/sdtdatahash" xmlns:w16se="http://schemas.microsoft.com/office/word/2015/wordml/symex" mc:Ignorable="w14 w15 w16se w16cid w16 w16cex w16sdtdh">
+<w:styles xmlns:mc="http://schemas.openxmlformats.org/markup-compatibility/2006" xmlns:r="http://schemas.openxmlformats.org/officeDocument/2006/relationships" xmlns:w="http://schemas.openxmlformats.org/wordprocessingml/2006/main" xmlns:w14="http://schemas.microsoft.com/office/word/2010/wordml" xmlns:w15="http://schemas.microsoft.com/office/word/2012/wordml" xmlns:w16cex="http://schemas.microsoft.com/office/word/2018/wordml/cex" xmlns:w16cid="http://schemas.microsoft.com/office/word/2016/wordml/cid" xmlns:w16="http://schemas.microsoft.com/office/word/2018/wordml" xmlns:w16du="http://schemas.microsoft.com/office/word/2023/wordml/word16du" xmlns:w16sdtdh="http://schemas.microsoft.com/office/word/2020/wordml/sdtdatahash" xmlns:w16sdtfl="http://schemas.microsoft.com/office/word/2024/wordml/sdtformatlock" xmlns:w16se="http://schemas.microsoft.com/office/word/2015/wordml/symex" mc:Ignorable="w14 w15 w16se w16cid w16 w16cex w16sdtdh w16sdtfl w16du">
   <w:docDefaults>
     <w:rPrDefault>
       <w:rPr>
@@ -4608,6 +5057,21 @@
     <w:unhideWhenUsed/>
     <w:rsid w:val="00C42DB3"/>
   </w:style>
+  <w:style w:type="paragraph" w:customStyle="1" w:styleId="Note">
+    <w:name w:val="Note"/>
+    <w:basedOn w:val="Normal"/>
+    <w:qFormat/>
+    <w:rsid w:val="0011696C"/>
+    <w:pPr>
+      <w:spacing w:after="240"/>
+      <w:ind w:left="720" w:hanging="720"/>
+      <w:jc w:val="both"/>
+    </w:pPr>
+    <w:rPr>
+      <w:rFonts w:eastAsia="Times New Roman"/>
+      <w:lang w:val="en-US"/>
+    </w:rPr>
+  </w:style>
 </w:styles>
 </file>
 

</xml_diff>